<commit_message>
Module 4 Note and Discussion
</commit_message>
<xml_diff>
--- a/DTSC-540_Intro_to_AI/Notes_module4.docx
+++ b/DTSC-540_Intro_to_AI/Notes_module4.docx
@@ -609,7 +609,15 @@
         </w:rPr>
       </w:pPr>
       <w:r>
-        <w:t>Neural Networks – similar to how the brain works, best for very complex pattern recognition scenarios</w:t>
+        <w:t xml:space="preserve">Neural Networks – </w:t>
+      </w:r>
+      <w:proofErr w:type="gramStart"/>
+      <w:r>
+        <w:t>similar to</w:t>
+      </w:r>
+      <w:proofErr w:type="gramEnd"/>
+      <w:r>
+        <w:t xml:space="preserve"> how the brain works, best for very complex pattern recognition scenarios</w:t>
       </w:r>
       <w:r>
         <w:rPr>
@@ -697,7 +705,15 @@
     </w:p>
     <w:p>
       <w:r>
-        <w:t xml:space="preserve">Statistics explains the system and values interpretability </w:t>
+        <w:t xml:space="preserve">Statistics </w:t>
+      </w:r>
+      <w:proofErr w:type="gramStart"/>
+      <w:r>
+        <w:t>explains</w:t>
+      </w:r>
+      <w:proofErr w:type="gramEnd"/>
+      <w:r>
+        <w:t xml:space="preserve"> the system and values interpretability </w:t>
       </w:r>
     </w:p>
     <w:p>
@@ -706,6 +722,321 @@
       </w:r>
     </w:p>
     <w:p/>
+    <w:p>
+      <w:r>
+        <w:drawing>
+          <wp:inline distT="0" distB="0" distL="0" distR="0" wp14:anchorId="3F0A656C" wp14:editId="0CE1AC11">
+            <wp:extent cx="4595258" cy="2530059"/>
+            <wp:effectExtent l="0" t="0" r="0" b="3810"/>
+            <wp:docPr id="641935587" name="Picture 1"/>
+            <wp:cNvGraphicFramePr>
+              <a:graphicFrameLocks xmlns:a="http://schemas.openxmlformats.org/drawingml/2006/main" noChangeAspect="1"/>
+            </wp:cNvGraphicFramePr>
+            <a:graphic xmlns:a="http://schemas.openxmlformats.org/drawingml/2006/main">
+              <a:graphicData uri="http://schemas.openxmlformats.org/drawingml/2006/picture">
+                <pic:pic xmlns:pic="http://schemas.openxmlformats.org/drawingml/2006/picture">
+                  <pic:nvPicPr>
+                    <pic:cNvPr id="641935587" name=""/>
+                    <pic:cNvPicPr/>
+                  </pic:nvPicPr>
+                  <pic:blipFill>
+                    <a:blip r:embed="rId21"/>
+                    <a:stretch>
+                      <a:fillRect/>
+                    </a:stretch>
+                  </pic:blipFill>
+                  <pic:spPr>
+                    <a:xfrm>
+                      <a:off x="0" y="0"/>
+                      <a:ext cx="4595258" cy="2530059"/>
+                    </a:xfrm>
+                    <a:prstGeom prst="rect">
+                      <a:avLst/>
+                    </a:prstGeom>
+                  </pic:spPr>
+                </pic:pic>
+              </a:graphicData>
+            </a:graphic>
+          </wp:inline>
+        </w:drawing>
+      </w:r>
+    </w:p>
+    <w:p>
+      <w:r>
+        <w:lastRenderedPageBreak/>
+        <w:drawing>
+          <wp:inline distT="0" distB="0" distL="0" distR="0" wp14:anchorId="2BE77982" wp14:editId="54A41E76">
+            <wp:extent cx="5943600" cy="2287905"/>
+            <wp:effectExtent l="0" t="0" r="0" b="0"/>
+            <wp:docPr id="404208709" name="Picture 1"/>
+            <wp:cNvGraphicFramePr>
+              <a:graphicFrameLocks xmlns:a="http://schemas.openxmlformats.org/drawingml/2006/main" noChangeAspect="1"/>
+            </wp:cNvGraphicFramePr>
+            <a:graphic xmlns:a="http://schemas.openxmlformats.org/drawingml/2006/main">
+              <a:graphicData uri="http://schemas.openxmlformats.org/drawingml/2006/picture">
+                <pic:pic xmlns:pic="http://schemas.openxmlformats.org/drawingml/2006/picture">
+                  <pic:nvPicPr>
+                    <pic:cNvPr id="404208709" name=""/>
+                    <pic:cNvPicPr/>
+                  </pic:nvPicPr>
+                  <pic:blipFill>
+                    <a:blip r:embed="rId22"/>
+                    <a:stretch>
+                      <a:fillRect/>
+                    </a:stretch>
+                  </pic:blipFill>
+                  <pic:spPr>
+                    <a:xfrm>
+                      <a:off x="0" y="0"/>
+                      <a:ext cx="5943600" cy="2287905"/>
+                    </a:xfrm>
+                    <a:prstGeom prst="rect">
+                      <a:avLst/>
+                    </a:prstGeom>
+                  </pic:spPr>
+                </pic:pic>
+              </a:graphicData>
+            </a:graphic>
+          </wp:inline>
+        </w:drawing>
+      </w:r>
+    </w:p>
+    <w:p>
+      <w:r>
+        <w:drawing>
+          <wp:inline distT="0" distB="0" distL="0" distR="0" wp14:anchorId="40BB4509" wp14:editId="5CE84226">
+            <wp:extent cx="5943600" cy="2268855"/>
+            <wp:effectExtent l="0" t="0" r="0" b="0"/>
+            <wp:docPr id="1954391742" name="Picture 1"/>
+            <wp:cNvGraphicFramePr>
+              <a:graphicFrameLocks xmlns:a="http://schemas.openxmlformats.org/drawingml/2006/main" noChangeAspect="1"/>
+            </wp:cNvGraphicFramePr>
+            <a:graphic xmlns:a="http://schemas.openxmlformats.org/drawingml/2006/main">
+              <a:graphicData uri="http://schemas.openxmlformats.org/drawingml/2006/picture">
+                <pic:pic xmlns:pic="http://schemas.openxmlformats.org/drawingml/2006/picture">
+                  <pic:nvPicPr>
+                    <pic:cNvPr id="1954391742" name=""/>
+                    <pic:cNvPicPr/>
+                  </pic:nvPicPr>
+                  <pic:blipFill>
+                    <a:blip r:embed="rId23"/>
+                    <a:stretch>
+                      <a:fillRect/>
+                    </a:stretch>
+                  </pic:blipFill>
+                  <pic:spPr>
+                    <a:xfrm>
+                      <a:off x="0" y="0"/>
+                      <a:ext cx="5943600" cy="2268855"/>
+                    </a:xfrm>
+                    <a:prstGeom prst="rect">
+                      <a:avLst/>
+                    </a:prstGeom>
+                  </pic:spPr>
+                </pic:pic>
+              </a:graphicData>
+            </a:graphic>
+          </wp:inline>
+        </w:drawing>
+      </w:r>
+    </w:p>
+    <w:p>
+      <w:r>
+        <w:drawing>
+          <wp:inline distT="0" distB="0" distL="0" distR="0" wp14:anchorId="7EC1CB40" wp14:editId="6B9F3FE6">
+            <wp:extent cx="4435224" cy="3292125"/>
+            <wp:effectExtent l="0" t="0" r="3810" b="3810"/>
+            <wp:docPr id="405820895" name="Picture 1"/>
+            <wp:cNvGraphicFramePr>
+              <a:graphicFrameLocks xmlns:a="http://schemas.openxmlformats.org/drawingml/2006/main" noChangeAspect="1"/>
+            </wp:cNvGraphicFramePr>
+            <a:graphic xmlns:a="http://schemas.openxmlformats.org/drawingml/2006/main">
+              <a:graphicData uri="http://schemas.openxmlformats.org/drawingml/2006/picture">
+                <pic:pic xmlns:pic="http://schemas.openxmlformats.org/drawingml/2006/picture">
+                  <pic:nvPicPr>
+                    <pic:cNvPr id="405820895" name=""/>
+                    <pic:cNvPicPr/>
+                  </pic:nvPicPr>
+                  <pic:blipFill>
+                    <a:blip r:embed="rId24"/>
+                    <a:stretch>
+                      <a:fillRect/>
+                    </a:stretch>
+                  </pic:blipFill>
+                  <pic:spPr>
+                    <a:xfrm>
+                      <a:off x="0" y="0"/>
+                      <a:ext cx="4435224" cy="3292125"/>
+                    </a:xfrm>
+                    <a:prstGeom prst="rect">
+                      <a:avLst/>
+                    </a:prstGeom>
+                  </pic:spPr>
+                </pic:pic>
+              </a:graphicData>
+            </a:graphic>
+          </wp:inline>
+        </w:drawing>
+      </w:r>
+    </w:p>
+    <w:p>
+      <w:r>
+        <w:lastRenderedPageBreak/>
+        <w:drawing>
+          <wp:inline distT="0" distB="0" distL="0" distR="0" wp14:anchorId="01EC501C" wp14:editId="61C9FCFD">
+            <wp:extent cx="3939881" cy="1661304"/>
+            <wp:effectExtent l="0" t="0" r="3810" b="0"/>
+            <wp:docPr id="870910267" name="Picture 1"/>
+            <wp:cNvGraphicFramePr>
+              <a:graphicFrameLocks xmlns:a="http://schemas.openxmlformats.org/drawingml/2006/main" noChangeAspect="1"/>
+            </wp:cNvGraphicFramePr>
+            <a:graphic xmlns:a="http://schemas.openxmlformats.org/drawingml/2006/main">
+              <a:graphicData uri="http://schemas.openxmlformats.org/drawingml/2006/picture">
+                <pic:pic xmlns:pic="http://schemas.openxmlformats.org/drawingml/2006/picture">
+                  <pic:nvPicPr>
+                    <pic:cNvPr id="870910267" name=""/>
+                    <pic:cNvPicPr/>
+                  </pic:nvPicPr>
+                  <pic:blipFill>
+                    <a:blip r:embed="rId25"/>
+                    <a:stretch>
+                      <a:fillRect/>
+                    </a:stretch>
+                  </pic:blipFill>
+                  <pic:spPr>
+                    <a:xfrm>
+                      <a:off x="0" y="0"/>
+                      <a:ext cx="3939881" cy="1661304"/>
+                    </a:xfrm>
+                    <a:prstGeom prst="rect">
+                      <a:avLst/>
+                    </a:prstGeom>
+                  </pic:spPr>
+                </pic:pic>
+              </a:graphicData>
+            </a:graphic>
+          </wp:inline>
+        </w:drawing>
+      </w:r>
+    </w:p>
+    <w:p/>
+    <w:p>
+      <w:r>
+        <w:drawing>
+          <wp:inline distT="0" distB="0" distL="0" distR="0" wp14:anchorId="00387E53" wp14:editId="1252E450">
+            <wp:extent cx="4397121" cy="1638442"/>
+            <wp:effectExtent l="0" t="0" r="3810" b="0"/>
+            <wp:docPr id="884965554" name="Picture 1"/>
+            <wp:cNvGraphicFramePr>
+              <a:graphicFrameLocks xmlns:a="http://schemas.openxmlformats.org/drawingml/2006/main" noChangeAspect="1"/>
+            </wp:cNvGraphicFramePr>
+            <a:graphic xmlns:a="http://schemas.openxmlformats.org/drawingml/2006/main">
+              <a:graphicData uri="http://schemas.openxmlformats.org/drawingml/2006/picture">
+                <pic:pic xmlns:pic="http://schemas.openxmlformats.org/drawingml/2006/picture">
+                  <pic:nvPicPr>
+                    <pic:cNvPr id="884965554" name=""/>
+                    <pic:cNvPicPr/>
+                  </pic:nvPicPr>
+                  <pic:blipFill>
+                    <a:blip r:embed="rId26"/>
+                    <a:stretch>
+                      <a:fillRect/>
+                    </a:stretch>
+                  </pic:blipFill>
+                  <pic:spPr>
+                    <a:xfrm>
+                      <a:off x="0" y="0"/>
+                      <a:ext cx="4397121" cy="1638442"/>
+                    </a:xfrm>
+                    <a:prstGeom prst="rect">
+                      <a:avLst/>
+                    </a:prstGeom>
+                  </pic:spPr>
+                </pic:pic>
+              </a:graphicData>
+            </a:graphic>
+          </wp:inline>
+        </w:drawing>
+      </w:r>
+    </w:p>
+    <w:p>
+      <w:r>
+        <w:drawing>
+          <wp:inline distT="0" distB="0" distL="0" distR="0" wp14:anchorId="6358807C" wp14:editId="5545F3E8">
+            <wp:extent cx="4465707" cy="853514"/>
+            <wp:effectExtent l="0" t="0" r="0" b="3810"/>
+            <wp:docPr id="720165041" name="Picture 1"/>
+            <wp:cNvGraphicFramePr>
+              <a:graphicFrameLocks xmlns:a="http://schemas.openxmlformats.org/drawingml/2006/main" noChangeAspect="1"/>
+            </wp:cNvGraphicFramePr>
+            <a:graphic xmlns:a="http://schemas.openxmlformats.org/drawingml/2006/main">
+              <a:graphicData uri="http://schemas.openxmlformats.org/drawingml/2006/picture">
+                <pic:pic xmlns:pic="http://schemas.openxmlformats.org/drawingml/2006/picture">
+                  <pic:nvPicPr>
+                    <pic:cNvPr id="720165041" name=""/>
+                    <pic:cNvPicPr/>
+                  </pic:nvPicPr>
+                  <pic:blipFill>
+                    <a:blip r:embed="rId27"/>
+                    <a:stretch>
+                      <a:fillRect/>
+                    </a:stretch>
+                  </pic:blipFill>
+                  <pic:spPr>
+                    <a:xfrm>
+                      <a:off x="0" y="0"/>
+                      <a:ext cx="4465707" cy="853514"/>
+                    </a:xfrm>
+                    <a:prstGeom prst="rect">
+                      <a:avLst/>
+                    </a:prstGeom>
+                  </pic:spPr>
+                </pic:pic>
+              </a:graphicData>
+            </a:graphic>
+          </wp:inline>
+        </w:drawing>
+      </w:r>
+    </w:p>
+    <w:p>
+      <w:r>
+        <w:drawing>
+          <wp:inline distT="0" distB="0" distL="0" distR="0" wp14:anchorId="4945C3F4" wp14:editId="147B429B">
+            <wp:extent cx="4397121" cy="2491956"/>
+            <wp:effectExtent l="0" t="0" r="3810" b="3810"/>
+            <wp:docPr id="602724230" name="Picture 1"/>
+            <wp:cNvGraphicFramePr>
+              <a:graphicFrameLocks xmlns:a="http://schemas.openxmlformats.org/drawingml/2006/main" noChangeAspect="1"/>
+            </wp:cNvGraphicFramePr>
+            <a:graphic xmlns:a="http://schemas.openxmlformats.org/drawingml/2006/main">
+              <a:graphicData uri="http://schemas.openxmlformats.org/drawingml/2006/picture">
+                <pic:pic xmlns:pic="http://schemas.openxmlformats.org/drawingml/2006/picture">
+                  <pic:nvPicPr>
+                    <pic:cNvPr id="602724230" name=""/>
+                    <pic:cNvPicPr/>
+                  </pic:nvPicPr>
+                  <pic:blipFill>
+                    <a:blip r:embed="rId28"/>
+                    <a:stretch>
+                      <a:fillRect/>
+                    </a:stretch>
+                  </pic:blipFill>
+                  <pic:spPr>
+                    <a:xfrm>
+                      <a:off x="0" y="0"/>
+                      <a:ext cx="4397121" cy="2491956"/>
+                    </a:xfrm>
+                    <a:prstGeom prst="rect">
+                      <a:avLst/>
+                    </a:prstGeom>
+                  </pic:spPr>
+                </pic:pic>
+              </a:graphicData>
+            </a:graphic>
+          </wp:inline>
+        </w:drawing>
+      </w:r>
+    </w:p>
     <w:p/>
     <w:sectPr>
       <w:pgSz w:w="12240" w:h="15840"/>

</xml_diff>